<commit_message>
docs: update live web URL to https://sentrix-ai-seven.vercel.app/
</commit_message>
<xml_diff>
--- a/Abuzaid_2005.docx
+++ b/Abuzaid_2005.docx
@@ -100,7 +100,7 @@
           </w:tcPr>
           <w:p>
             <w:r>
-              <w:t>• Live Web Platform: https://abuzaid-01-master-card-frontend.pages.dev/</w:t>
+              <w:t>• Live Web Platform: https://sentrix-ai-seven.vercel.app/</w:t>
               <w:br/>
               <w:t>• FastAPI API Docs: https://master-card.onrender.com/docs</w:t>
               <w:br/>
@@ -1383,7 +1383,7 @@
     </w:p>
     <w:p>
       <w:r>
-        <w:t>• Interactive Web Dashboard: https://abuzaid-01-master-card-frontend.pages.dev/</w:t>
+        <w:t>• Interactive Web Dashboard: https://sentrix-ai-seven.vercel.app/</w:t>
       </w:r>
     </w:p>
     <w:p>

</xml_diff>

<commit_message>
docs: remove evaluation criteria matrix from submission document
</commit_message>
<xml_diff>
--- a/Abuzaid_2005.docx
+++ b/Abuzaid_2005.docx
@@ -1130,250 +1130,7 @@
         <w:rPr>
           <w:color w:val="EB001B"/>
         </w:rPr>
-        <w:t>6. Official Evaluation Criteria Alignment Matrix</w:t>
-      </w:r>
-    </w:p>
-    <w:tbl>
-      <w:tblPr>
-        <w:tblW w:type="auto" w:w="0"/>
-        <w:jc w:val="center"/>
-        <w:tblLook w:firstColumn="1" w:firstRow="1" w:lastColumn="0" w:lastRow="0" w:noHBand="0" w:noVBand="1" w:val="04A0"/>
-      </w:tblPr>
-      <w:tblGrid>
-        <w:gridCol w:w="3312"/>
-        <w:gridCol w:w="3312"/>
-        <w:gridCol w:w="3312"/>
-      </w:tblGrid>
-      <w:tr>
-        <w:tc>
-          <w:tcPr>
-            <w:tcW w:type="dxa" w:w="3312"/>
-            <w:shd w:fill="EAEAEA"/>
-          </w:tcPr>
-          <w:p>
-            <w:r>
-              <w:rPr>
-                <w:b/>
-              </w:rPr>
-              <w:t>Challenge Evaluation Criterion</w:t>
-            </w:r>
-          </w:p>
-        </w:tc>
-        <w:tc>
-          <w:tcPr>
-            <w:tcW w:type="dxa" w:w="3312"/>
-            <w:shd w:fill="EAEAEA"/>
-          </w:tcPr>
-          <w:p>
-            <w:r>
-              <w:rPr>
-                <w:b/>
-              </w:rPr>
-              <w:t>SENTRIX AI Benchmark</w:t>
-            </w:r>
-          </w:p>
-        </w:tc>
-        <w:tc>
-          <w:tcPr>
-            <w:tcW w:type="dxa" w:w="3312"/>
-            <w:shd w:fill="EAEAEA"/>
-          </w:tcPr>
-          <w:p>
-            <w:r>
-              <w:rPr>
-                <w:b/>
-              </w:rPr>
-              <w:t>Technical Implementation Evidence</w:t>
-            </w:r>
-          </w:p>
-        </w:tc>
-      </w:tr>
-      <w:tr>
-        <w:tc>
-          <w:tcPr>
-            <w:tcW w:type="dxa" w:w="3312"/>
-          </w:tcPr>
-          <w:p>
-            <w:r>
-              <w:rPr>
-                <w:b/>
-              </w:rPr>
-              <w:t>Diversity of Attacks Identified</w:t>
-            </w:r>
-          </w:p>
-        </w:tc>
-        <w:tc>
-          <w:tcPr>
-            <w:tcW w:type="dxa" w:w="3312"/>
-          </w:tcPr>
-          <w:p>
-            <w:r>
-              <w:t>High (Exhaustive)</w:t>
-            </w:r>
-          </w:p>
-        </w:tc>
-        <w:tc>
-          <w:tcPr>
-            <w:tcW w:type="dxa" w:w="3312"/>
-          </w:tcPr>
-          <w:p>
-            <w:r>
-              <w:t>36 Real-World Vectors across 5 Pillars covering conversational LLMs, tool calling, wallet push provisioning, NFC ghost tap relays, instant UPI/FedNow smurfing, crypto mixers, and adversarial RL evasion.</w:t>
-            </w:r>
-          </w:p>
-        </w:tc>
-      </w:tr>
-      <w:tr>
-        <w:tc>
-          <w:tcPr>
-            <w:tcW w:type="dxa" w:w="3312"/>
-          </w:tcPr>
-          <w:p>
-            <w:r>
-              <w:rPr>
-                <w:b/>
-              </w:rPr>
-              <w:t>Fidelity of Attacks in Simulation</w:t>
-            </w:r>
-          </w:p>
-        </w:tc>
-        <w:tc>
-          <w:tcPr>
-            <w:tcW w:type="dxa" w:w="3312"/>
-          </w:tcPr>
-          <w:p>
-            <w:r>
-              <w:t>100% Invariant Compliance</w:t>
-            </w:r>
-          </w:p>
-        </w:tc>
-        <w:tc>
-          <w:tcPr>
-            <w:tcW w:type="dxa" w:w="3312"/>
-          </w:tcPr>
-          <w:p>
-            <w:r>
-              <w:t>50,000 Tabular (15 features), 1,500 Text, 7,478 Graph edges, 50,000 Evasion records. 100% pass rate across 38 domain rules and verified against 20,000 real IEEE-CIS records via TSTR.</w:t>
-            </w:r>
-          </w:p>
-        </w:tc>
-      </w:tr>
-      <w:tr>
-        <w:tc>
-          <w:tcPr>
-            <w:tcW w:type="dxa" w:w="3312"/>
-          </w:tcPr>
-          <w:p>
-            <w:r>
-              <w:rPr>
-                <w:b/>
-              </w:rPr>
-              <w:t>Detection Algorithms &amp; Efficacy</w:t>
-            </w:r>
-          </w:p>
-        </w:tc>
-        <w:tc>
-          <w:tcPr>
-            <w:tcW w:type="dxa" w:w="3312"/>
-          </w:tcPr>
-          <w:p>
-            <w:r>
-              <w:t>Sub-Millisecond &amp; High AUC</w:t>
-            </w:r>
-          </w:p>
-        </w:tc>
-        <w:tc>
-          <w:tcPr>
-            <w:tcW w:type="dxa" w:w="3312"/>
-          </w:tcPr>
-          <w:p>
-            <w:r>
-              <w:t>ONNX Tabular (0.006 ms latency, AUC-PR 0.8031), Dense Semantic Text (AUC-PR 1.0, +9.19% lift on paraphrased zero-days), Graph GBDT (AUC-PR 0.9630, F1 0.9025).</w:t>
-            </w:r>
-          </w:p>
-        </w:tc>
-      </w:tr>
-      <w:tr>
-        <w:tc>
-          <w:tcPr>
-            <w:tcW w:type="dxa" w:w="3312"/>
-          </w:tcPr>
-          <w:p>
-            <w:r>
-              <w:rPr>
-                <w:b/>
-              </w:rPr>
-              <w:t>Novelty of the Solution</w:t>
-            </w:r>
-          </w:p>
-        </w:tc>
-        <w:tc>
-          <w:tcPr>
-            <w:tcW w:type="dxa" w:w="3312"/>
-          </w:tcPr>
-          <w:p>
-            <w:r>
-              <w:t>Industry Firsts</w:t>
-            </w:r>
-          </w:p>
-        </w:tc>
-        <w:tc>
-          <w:tcPr>
-            <w:tcW w:type="dxa" w:w="3312"/>
-          </w:tcPr>
-          <w:p>
-            <w:r>
-              <w:t>First cross-vector mathematical risk fusion correlating Chatbot + Gateway + Mule Layering. First model-aware multi-strategy active learning feedback loop with automated anti-forgetting audit.</w:t>
-            </w:r>
-          </w:p>
-        </w:tc>
-      </w:tr>
-      <w:tr>
-        <w:tc>
-          <w:tcPr>
-            <w:tcW w:type="dxa" w:w="3312"/>
-          </w:tcPr>
-          <w:p>
-            <w:r>
-              <w:rPr>
-                <w:b/>
-              </w:rPr>
-              <w:t>Real-World Feasibility in Live Payments</w:t>
-            </w:r>
-          </w:p>
-        </w:tc>
-        <w:tc>
-          <w:tcPr>
-            <w:tcW w:type="dxa" w:w="3312"/>
-          </w:tcPr>
-          <w:p>
-            <w:r>
-              <w:t>Production-Ready</w:t>
-            </w:r>
-          </w:p>
-        </w:tc>
-        <w:tc>
-          <w:tcPr>
-            <w:tcW w:type="dxa" w:w="3312"/>
-          </w:tcPr>
-          <w:p>
-            <w:r>
-              <w:t>Zero PyTorch runtime overhead in production (pure ONNX Runtime C++ engine), sub-50ms SLA compliance, $3,071.97 financial threshold optimization, and live PCI-DSS SHAP attribution.</w:t>
-            </w:r>
-          </w:p>
-        </w:tc>
-      </w:tr>
-    </w:tbl>
-    <w:p/>
-    <w:p>
-      <w:pPr>
-        <w:pStyle w:val="Heading1"/>
-      </w:pPr>
-      <w:r>
-        <w:rPr>
-          <w:color w:val="EB001B"/>
-        </w:rPr>
-        <w:t>7. Conclusion &amp; Live Deployment Links</w:t>
+        <w:t>6. Conclusion &amp; Live Deployment Links</w:t>
       </w:r>
     </w:p>
     <w:p>

</xml_diff>

<commit_message>
feat: add dynamic animated status lines and stage-specific feedback to live pipeline
</commit_message>
<xml_diff>
--- a/Abuzaid_2005.docx
+++ b/Abuzaid_2005.docx
@@ -10,7 +10,7 @@
         <w:rPr>
           <w:rFonts w:ascii="Arial" w:hAnsi="Arial"/>
           <w:b/>
-          <w:color w:val="EB001B"/>
+          <w:color w:val="000000"/>
           <w:sz w:val="52"/>
         </w:rPr>
         <w:t>SENTRIX AI</w:t>
@@ -38,7 +38,7 @@
         <w:rPr>
           <w:rFonts w:ascii="Arial" w:hAnsi="Arial"/>
           <w:b/>
-          <w:color w:val="FF5F00"/>
+          <w:color w:val="000000"/>
           <w:sz w:val="20"/>
         </w:rPr>
         <w:t>Mastercard Innovation Challenge @ Global Fintech Fest (GFF) 2026 | Submission Category: AI Defense Lab</w:t>
@@ -162,7 +162,7 @@
       </w:pPr>
       <w:r>
         <w:rPr>
-          <w:color w:val="EB001B"/>
+          <w:color w:val="000000"/>
         </w:rPr>
         <w:t>1. Executive Summary &amp; Core Innovation</w:t>
       </w:r>
@@ -174,7 +174,7 @@
     </w:p>
     <w:p>
       <w:r>
-        <w:t>SENTRIX AI delivers an end-to-end, closed-loop Red Team/Blue Team platform designed specifically for payment networks. It operates across three tightly integrated pillars: (1) an exhaustive 36-vector threat taxonomy grounded in FinCEN Alert FIN-2024-Alert004 and Federal Reserve FraudClassifier standards, (2) high-fidelity synthetic attack generators verified against real IEEE-CIS data with 100% domain invariant compliance across 38 rules, and (3) a multi-model defense suite featuring sub-millisecond ONNX-quantized inference, dense semantic prompt injection detectors, topological graph GBDTs, financial cost optimization, and active learning retraining that eliminates catastrophic forgetting.</w:t>
+        <w:t>SENTRIX AI is an end-to-end, closed-loop Red Team/Blue Team prototype for payment networks. It combines: (1) a 36-vector fraud taxonomy informed by regulatory and real-world payment-fraud patterns; (2) synthetic tabular, text, graph, and adversarial-evasion datasets checked against explicit domain rules; and (3) specialised detection models, risk fusion, cost-aware thresholding, and active-learning retraining. The goal is straightforward: simulate coordinated fraud safely, detect it across modalities, and continuously test where the defence is weakest.</w:t>
       </w:r>
     </w:p>
     <w:p>
@@ -183,7 +183,7 @@
       </w:pPr>
       <w:r>
         <w:rPr>
-          <w:color w:val="EB001B"/>
+          <w:color w:val="000000"/>
         </w:rPr>
         <w:t>2. Pillar 1: Threat Identification &amp; 36-Vector Taxonomy</w:t>
       </w:r>
@@ -366,14 +366,25 @@
       </w:pPr>
       <w:r>
         <w:rPr>
-          <w:color w:val="EB001B"/>
+          <w:color w:val="000000"/>
         </w:rPr>
         <w:t>3. Pillar 2: Synthetic Attack Generation &amp; Statistical Fidelity</w:t>
       </w:r>
     </w:p>
     <w:p>
       <w:r>
-        <w:t>To ensure generated attack datasets are genuinely useful for training production defenses, SENTRIX AI deploys modality-specific synthetic generators governed by strict domain invariants:</w:t>
+        <w:t>Each generator starts from known fraud mechanics, varies the signals an attacker would manipulate, and validates the exported records before they enter model training. This creates realistic enough stress cases without using customer data.</w:t>
+      </w:r>
+    </w:p>
+    <w:p>
+      <w:r>
+        <w:rPr>
+          <w:b/>
+        </w:rPr>
+        <w:t xml:space="preserve">How vectors are produced and used. </w:t>
+      </w:r>
+      <w:r>
+        <w:t>The tabular generator mixes ordinary spend, hard negatives, fraud sub-types, and controlled label noise across 15 features. The text generator expands seeded prompts with template and slot variations. The graph generator builds organic transfers alongside mule rings, then derives degree, funnel, and pass-through signals. A separate evasion pass mutates fraud records to imitate threshold skirting, spoofed device signals, velocity dilution, poisoning, and boundary probing. Finally, 100 cross-vector scenarios link text, payment, and laundering stages into one campaign.</w:t>
       </w:r>
     </w:p>
     <w:tbl>
@@ -383,15 +394,14 @@
         <w:tblLook w:firstColumn="1" w:firstRow="1" w:lastColumn="0" w:lastRow="0" w:noHBand="0" w:noVBand="1" w:val="04A0"/>
       </w:tblPr>
       <w:tblGrid>
-        <w:gridCol w:w="2484"/>
-        <w:gridCol w:w="2484"/>
-        <w:gridCol w:w="2484"/>
-        <w:gridCol w:w="2484"/>
+        <w:gridCol w:w="3312"/>
+        <w:gridCol w:w="3312"/>
+        <w:gridCol w:w="3312"/>
       </w:tblGrid>
       <w:tr>
         <w:tc>
           <w:tcPr>
-            <w:tcW w:type="dxa" w:w="2484"/>
+            <w:tcW w:type="dxa" w:w="3312"/>
             <w:shd w:fill="EAEAEA"/>
           </w:tcPr>
           <w:p>
@@ -405,7 +415,7 @@
         </w:tc>
         <w:tc>
           <w:tcPr>
-            <w:tcW w:type="dxa" w:w="2484"/>
+            <w:tcW w:type="dxa" w:w="3312"/>
             <w:shd w:fill="EAEAEA"/>
           </w:tcPr>
           <w:p>
@@ -419,7 +429,7 @@
         </w:tc>
         <w:tc>
           <w:tcPr>
-            <w:tcW w:type="dxa" w:w="2484"/>
+            <w:tcW w:type="dxa" w:w="3312"/>
             <w:shd w:fill="EAEAEA"/>
           </w:tcPr>
           <w:p>
@@ -427,21 +437,7 @@
               <w:rPr>
                 <w:b/>
               </w:rPr>
-              <w:t>Feature Space &amp; Architecture</w:t>
-            </w:r>
-          </w:p>
-        </w:tc>
-        <w:tc>
-          <w:tcPr>
-            <w:tcW w:type="dxa" w:w="2484"/>
-            <w:shd w:fill="EAEAEA"/>
-          </w:tcPr>
-          <w:p>
-            <w:r>
-              <w:rPr>
-                <w:b/>
-              </w:rPr>
-              <w:t>Domain Pass Rate</w:t>
+              <w:t>How It Is Generated</w:t>
             </w:r>
           </w:p>
         </w:tc>
@@ -449,7 +445,7 @@
       <w:tr>
         <w:tc>
           <w:tcPr>
-            <w:tcW w:type="dxa" w:w="2484"/>
+            <w:tcW w:type="dxa" w:w="3312"/>
           </w:tcPr>
           <w:p>
             <w:r>
@@ -462,31 +458,21 @@
         </w:tc>
         <w:tc>
           <w:tcPr>
-            <w:tcW w:type="dxa" w:w="2484"/>
+            <w:tcW w:type="dxa" w:w="3312"/>
           </w:tcPr>
           <w:p>
             <w:r>
-              <w:t>50,000 Transactions</w:t>
+              <w:t>50,000 transactions</w:t>
             </w:r>
           </w:p>
         </w:tc>
         <w:tc>
           <w:tcPr>
-            <w:tcW w:type="dxa" w:w="2484"/>
+            <w:tcW w:type="dxa" w:w="3312"/>
           </w:tcPr>
           <w:p>
             <w:r>
-              <w:t>12 sub-types across 15 enterprise features (Amount, Velocity, Device Risk, Decline, Diurnal Sin/Cos, MCC Weight, Geo Distance, Card Age, Failed Attempts, Provisioning Channel, NFC Tap Latency, BNPL Inquiries, RaaS Dispute Score, BOPIS Delay).</w:t>
-            </w:r>
-          </w:p>
-        </w:tc>
-        <w:tc>
-          <w:tcPr>
-            <w:tcW w:type="dxa" w:w="2484"/>
-          </w:tcPr>
-          <w:p>
-            <w:r>
-              <w:t>100.0% Pass Rate (13 Invariant Rules TAB.1–TAB.13)</w:t>
+              <w:t>15 signals covering amount, velocity, device risk, decline state, timing, merchant risk, geography, card history, and newer payment-rail indicators. Includes 12 fraud sub-types, normal activity, and hard negatives.</w:t>
             </w:r>
           </w:p>
         </w:tc>
@@ -494,7 +480,7 @@
       <w:tr>
         <w:tc>
           <w:tcPr>
-            <w:tcW w:type="dxa" w:w="2484"/>
+            <w:tcW w:type="dxa" w:w="3312"/>
           </w:tcPr>
           <w:p>
             <w:r>
@@ -507,31 +493,21 @@
         </w:tc>
         <w:tc>
           <w:tcPr>
-            <w:tcW w:type="dxa" w:w="2484"/>
+            <w:tcW w:type="dxa" w:w="3312"/>
           </w:tcPr>
           <w:p>
             <w:r>
-              <w:t>1,500 Prompts</w:t>
+              <w:t>1,500 prompts</w:t>
             </w:r>
           </w:p>
         </w:tc>
         <w:tc>
           <w:tcPr>
-            <w:tcW w:type="dxa" w:w="2484"/>
+            <w:tcW w:type="dxa" w:w="3312"/>
           </w:tcPr>
           <w:p>
             <w:r>
-              <w:t>18 categories (17 adversarial + legitimate inquiries) synthesized via Groq Cloud (GPT OSS 120B / Llama 3.3 70B) and Google Gemini 3.5 Flash Lite with Platt-calibrated embeddings.</w:t>
-            </w:r>
-          </w:p>
-        </w:tc>
-        <w:tc>
-          <w:tcPr>
-            <w:tcW w:type="dxa" w:w="2484"/>
-          </w:tcPr>
-          <w:p>
-            <w:r>
-              <w:t>100.0% Pass Rate (6 Invariant Rules T.1–T.6)</w:t>
+              <w:t>17 malicious categories plus legitimate customer queries. Seed prompts are expanded with deterministic templates and slot variations, including multilingual, encoded, multi-turn, and tool-use attacks.</w:t>
             </w:r>
           </w:p>
         </w:tc>
@@ -539,7 +515,7 @@
       <w:tr>
         <w:tc>
           <w:tcPr>
-            <w:tcW w:type="dxa" w:w="2484"/>
+            <w:tcW w:type="dxa" w:w="3312"/>
           </w:tcPr>
           <w:p>
             <w:r>
@@ -552,31 +528,21 @@
         </w:tc>
         <w:tc>
           <w:tcPr>
-            <w:tcW w:type="dxa" w:w="2484"/>
+            <w:tcW w:type="dxa" w:w="3312"/>
           </w:tcPr>
           <w:p>
             <w:r>
-              <w:t>7,478 Transfers</w:t>
+              <w:t>7,478 transfers</w:t>
             </w:r>
           </w:p>
         </w:tc>
         <w:tc>
           <w:tcPr>
-            <w:tcW w:type="dxa" w:w="2484"/>
+            <w:tcW w:type="dxa" w:w="3312"/>
           </w:tcPr>
           <w:p>
             <w:r>
-              <w:t>1,000 nodes, 100 mule rings, 7 laundering topologies generated using NetworkX directed multi-graphs with conserved monetary flow and realistic timestamp delays.</w:t>
-            </w:r>
-          </w:p>
-        </w:tc>
-        <w:tc>
-          <w:tcPr>
-            <w:tcW w:type="dxa" w:w="2484"/>
-          </w:tcPr>
-          <w:p>
-            <w:r>
-              <w:t>100.0% Pass Rate (6 Invariant Rules G.1–G.6)</w:t>
+              <w:t>1,000 accounts and 100 mule rings across seven laundering patterns: chains, fan-out, smurfing, wash cycles, instant micro-smurfing, chameleon traffic, and crypto off-ramping.</w:t>
             </w:r>
           </w:p>
         </w:tc>
@@ -584,7 +550,7 @@
       <w:tr>
         <w:tc>
           <w:tcPr>
-            <w:tcW w:type="dxa" w:w="2484"/>
+            <w:tcW w:type="dxa" w:w="3312"/>
           </w:tcPr>
           <w:p>
             <w:r>
@@ -597,31 +563,21 @@
         </w:tc>
         <w:tc>
           <w:tcPr>
-            <w:tcW w:type="dxa" w:w="2484"/>
+            <w:tcW w:type="dxa" w:w="3312"/>
           </w:tcPr>
           <w:p>
             <w:r>
-              <w:t>50,000 Perturbations</w:t>
+              <w:t>1,211 mutated fraud records</w:t>
             </w:r>
           </w:p>
         </w:tc>
         <w:tc>
           <w:tcPr>
-            <w:tcW w:type="dxa" w:w="2484"/>
+            <w:tcW w:type="dxa" w:w="3312"/>
           </w:tcPr>
           <w:p>
             <w:r>
-              <w:t>7 adversarial attack strategies applying boundary-skirting perturbations, model poisoning triggers, and reinforcement learning policy shifts.</w:t>
-            </w:r>
-          </w:p>
-        </w:tc>
-        <w:tc>
-          <w:tcPr>
-            <w:tcW w:type="dxa" w:w="2484"/>
-          </w:tcPr>
-          <w:p>
-            <w:r>
-              <w:t>100.0% Pass Rate (13 Invariant Rules EV.1–EV.13)</w:t>
+              <w:t>Seven perturbation strategies modify a copy of the tabular data: amount structuring, timing jitter, device spoofing, velocity dilution, poisoning triggers, and two forms of boundary probing.</w:t>
             </w:r>
           </w:p>
         </w:tc>
@@ -629,7 +585,7 @@
       <w:tr>
         <w:tc>
           <w:tcPr>
-            <w:tcW w:type="dxa" w:w="2484"/>
+            <w:tcW w:type="dxa" w:w="3312"/>
           </w:tcPr>
           <w:p>
             <w:r>
@@ -642,7 +598,7 @@
         </w:tc>
         <w:tc>
           <w:tcPr>
-            <w:tcW w:type="dxa" w:w="2484"/>
+            <w:tcW w:type="dxa" w:w="3312"/>
           </w:tcPr>
           <w:p>
             <w:r>
@@ -652,21 +608,11 @@
         </w:tc>
         <w:tc>
           <w:tcPr>
-            <w:tcW w:type="dxa" w:w="2484"/>
+            <w:tcW w:type="dxa" w:w="3312"/>
           </w:tcPr>
           <w:p>
             <w:r>
               <w:t>Procedural multi-stage campaigns correlating chatbot text injection, gateway card testing, and graph laundering flows with 100% unique entity IDs.</w:t>
-            </w:r>
-          </w:p>
-        </w:tc>
-        <w:tc>
-          <w:tcPr>
-            <w:tcW w:type="dxa" w:w="2484"/>
-          </w:tcPr>
-          <w:p>
-            <w:r>
-              <w:t>100.0% Unique Entities &amp; Valid Timelines</w:t>
             </w:r>
           </w:p>
         </w:tc>
@@ -675,7 +621,7 @@
     <w:p>
       <w:r>
         <w:br/>
-        <w:t>Fidelity Benchmark: Evaluated using Train-on-Synthetic, Test-on-Real (TSTR) protocol against 20,000 real IEEE-CIS fraud benchmark records (TransactionAmt, C12 velocity, V201 device risk), confirming statistical distributional alignment without synthetic artifacts.</w:t>
+        <w:t>Validation note: the project also runs Train-on-Synthetic, Test-on-Real (TSTR) and distributional checks against 20,000 IEEE-CIS benchmark records. These results are an early utility and distributional comparison—not a claim that synthetic data is equivalent to production traffic.</w:t>
       </w:r>
     </w:p>
     <w:p>
@@ -684,14 +630,14 @@
       </w:pPr>
       <w:r>
         <w:rPr>
-          <w:color w:val="EB001B"/>
+          <w:color w:val="000000"/>
         </w:rPr>
         <w:t>4. Pillar 3: Multi-Model Defense Heads &amp; Efficacy</w:t>
       </w:r>
     </w:p>
     <w:p>
       <w:r>
-        <w:t>The defense suite features three specialized heads operating in parallel, combined via a unified mathematical fusion engine:</w:t>
+        <w:t>The defence suite uses three specialist heads in parallel. Each returns a risk probability; the fusion layer combines the signals and selects an operational recommendation.</w:t>
       </w:r>
     </w:p>
     <w:tbl>
@@ -799,7 +745,7 @@
           </w:tcPr>
           <w:p>
             <w:r>
-              <w:t>ONNX-Quantized XGBoost + Isolation Forest</w:t>
+              <w:t>ONNX-exported XGBoost + Isolation Forest</w:t>
             </w:r>
           </w:p>
         </w:tc>
@@ -833,7 +779,7 @@
           </w:tcPr>
           <w:p>
             <w:r>
-              <w:t>sub-50ms SLA met (8,300x faster than threshold)</w:t>
+              <w:t>Meets the project’s sub-50 ms inference target on the local benchmark</w:t>
             </w:r>
           </w:p>
         </w:tc>
@@ -858,7 +804,7 @@
           </w:tcPr>
           <w:p>
             <w:r>
-              <w:t>SentenceTransformers (all-MiniLM-L6-v2) + Platt Scaling</w:t>
+              <w:t>ONNX MiniLM embeddings + calibrated classifier and similarity ensemble</w:t>
             </w:r>
           </w:p>
         </w:tc>
@@ -870,9 +816,9 @@
             <w:r>
               <w:t>Semantic AUC-PR: 1.0000</w:t>
               <w:br/>
-              <w:t>Paraphrased Lift: +9.19% vs TF-IDF</w:t>
+              <w:t>Paraphrased lift: +9.19% vs TF-IDF</w:t>
               <w:br/>
-              <w:t>Optimal Threshold: 0.2927</w:t>
+              <w:t>Threshold: 0.2927</w:t>
             </w:r>
           </w:p>
         </w:tc>
@@ -882,7 +828,7 @@
           </w:tcPr>
           <w:p>
             <w:r>
-              <w:t>1.42 ms</w:t>
+              <w:t>Not separately reported</w:t>
             </w:r>
           </w:p>
         </w:tc>
@@ -892,7 +838,7 @@
           </w:tcPr>
           <w:p>
             <w:r>
-              <w:t>Captures zero-day semantic shifts invisible to keywords</w:t>
+              <w:t>Captures meaning-level variation that keyword-only features can miss</w:t>
             </w:r>
           </w:p>
         </w:tc>
@@ -917,7 +863,7 @@
           </w:tcPr>
           <w:p>
             <w:r>
-              <w:t>HistGradientBoosting on NetworkX Graph Topologies</w:t>
+              <w:t>HistGradientBoosting on NetworkX topology features</w:t>
             </w:r>
           </w:p>
         </w:tc>
@@ -931,7 +877,7 @@
               <w:br/>
               <w:t>F1 Score: 0.9025</w:t>
               <w:br/>
-              <w:t>Optimal Threshold: 0.50</w:t>
+              <w:t>Threshold tuned on validation</w:t>
             </w:r>
           </w:p>
         </w:tc>
@@ -941,7 +887,7 @@
           </w:tcPr>
           <w:p>
             <w:r>
-              <w:t>0.082 ms</w:t>
+              <w:t>Not separately reported</w:t>
             </w:r>
           </w:p>
         </w:tc>
@@ -951,7 +897,7 @@
           </w:tcPr>
           <w:p>
             <w:r>
-              <w:t>Identifies instant smurfing, crypto mixers, and chameleon rings</w:t>
+              <w:t>Scores rapid pass-through, high-degree, and funnel-like behaviour</w:t>
             </w:r>
           </w:p>
         </w:tc>
@@ -1035,7 +981,7 @@
           </w:tcPr>
           <w:p>
             <w:r>
-              <w:t>Correlated Joint Risk Formula + Autonomous Kill Switch</w:t>
+              <w:t>Joint-risk formula + action policy</w:t>
             </w:r>
           </w:p>
         </w:tc>
@@ -1045,11 +991,11 @@
           </w:tcPr>
           <w:p>
             <w:r>
-              <w:t>Joint Score: 1 - Prod(1-Pi) + Delta</w:t>
+              <w:t>1 - Product(1-Pi) + synergy</w:t>
               <w:br/>
-              <w:t>Critical Action: Instant Kill Switch (&gt;=0.80)</w:t>
+              <w:t>Critical: &gt;=0.80</w:t>
               <w:br/>
-              <w:t>High Action: Step-Up 2FA (0.50-0.79)</w:t>
+              <w:t>High: 0.50–0.79</w:t>
             </w:r>
           </w:p>
         </w:tc>
@@ -1059,7 +1005,7 @@
           </w:tcPr>
           <w:p>
             <w:r>
-              <w:t>15.5 - 32.9 ms</w:t>
+              <w:t>Scenario execution</w:t>
             </w:r>
           </w:p>
         </w:tc>
@@ -1069,7 +1015,7 @@
           </w:tcPr>
           <w:p>
             <w:r>
-              <w:t>Autonomous real-time token revocation and wire interception</w:t>
+              <w:t>Returns freeze, step-up, or monitor recommendations for payment-rail integration</w:t>
             </w:r>
           </w:p>
         </w:tc>
@@ -1078,7 +1024,7 @@
     <w:p>
       <w:r>
         <w:br/>
-        <w:t>Explainability &amp; Compliance: Global and local TreeSHAP attribution computed across all 15 features (Top: failed_attempts_24h = 0.1281, nfc_tap_latency_ms = 0.1078, bnpl_bureau_inquiries = 0.1058), satisfying PCI-DSS and SR 11-7 model governance standards.</w:t>
+        <w:t>Explainability: global and per-transaction TreeSHAP attribution is available across all 15 tabular features (the top three are failed_attempts_24h, nfc_tap_latency_ms, and bnpl_bureau_inquiries). This provides traceable model evidence to support a future PCI-DSS and model-governance review; it is not a compliance certification.</w:t>
       </w:r>
     </w:p>
     <w:p>
@@ -1087,39 +1033,34 @@
       </w:pPr>
       <w:r>
         <w:rPr>
-          <w:color w:val="EB001B"/>
+          <w:color w:val="000000"/>
         </w:rPr>
         <w:t>5. Pillar 4: Closed-Loop Adversarial Active Learning</w:t>
       </w:r>
     </w:p>
     <w:p>
       <w:r>
-        <w:t>The cornerstone of SENTRIX AI is its self-healing feedback loop. Simulated attacks are not static test benchmarks—they become the dynamic training ground for active model retraining:</w:t>
+        <w:t>The closed loop makes the evaluation practical: it keeps an unseen partition, probes the first-round models, retrains on discovered misses, and then checks both adversarial and baseline performance:</w:t>
       </w:r>
     </w:p>
     <w:p>
       <w:r>
-        <w:t>1. Holdout Partitioning: Step 4 holdout data is split strictly 50/50 into a Mining Partition and an Unseen Final Evaluation Partition.</w:t>
+        <w:t>1. Holdout Partitioning: Step 4 holdout data is split 50/50 into a mining partition and an unseen final-evaluation partition.</w:t>
       </w:r>
     </w:p>
     <w:p>
       <w:r>
-        <w:t>2. Model-Aware Probing: A multi-strategy prober (7 tabular strategies including push provisioning spoofing, NFC delay compression, and BNPL masking; 5 graph strategies; 3 semantic prompt mutations) iteratively attacks Round 1 defenses to discover decision-boundary blind spots.</w:t>
+        <w:t>2. Model-Aware Probing: targeted tabular, graph, and text mutations probe the Round 1 decision boundaries to expose blind spots.</w:t>
       </w:r>
     </w:p>
     <w:p>
       <w:r>
-        <w:t>3. Automated Failure Mining: Mined samples that successfully evaded Round 1 (34.7% tabular evasion rate, 57.9% graph evasion rate) are automatically labeled and merged into the training pool (+4,683 tabular, +711 graph records) without human annotation.</w:t>
+        <w:t>3. Failure Mining and Retraining: evaded samples are automatically labelled and added to the training pool (+4,683 tabular and +711 graph records).</w:t>
       </w:r>
     </w:p>
     <w:p>
       <w:r>
-        <w:t>4. Round 2 Active Retraining: Round 2 models are trained and exported to ONNX.</w:t>
-      </w:r>
-    </w:p>
-    <w:p>
-      <w:r>
-        <w:t>5. Generalization &amp; Catastrophic Forgetting Audit: Evaluated on the unseen adversarial test set. Graph Mule Catch Rate jumped from 39.8% in Round 1 to 87.5% in Round 2 (+42 adversarial mule rings intercepted, AUC-PR increased from 0.7114 to 0.9404, delta = +0.2290). Baseline validation FPR halved from 0.97% to 0.45%, verifying ZERO catastrophic forgetting.</w:t>
+        <w:t>4. Evaluation: on unseen adversarial graph data, the mule catch rate improved from 39.8% to 87.5% (+42 catches) and AUC-PR rose from 0.7114 to 0.9404. Baseline graph AUC-PR changed by only -0.0019, so the project’s forgetting check did not flag material regression.</w:t>
       </w:r>
     </w:p>
     <w:p>
@@ -1128,14 +1069,14 @@
       </w:pPr>
       <w:r>
         <w:rPr>
-          <w:color w:val="EB001B"/>
+          <w:color w:val="000000"/>
         </w:rPr>
         <w:t>6. Conclusion &amp; Live Deployment Links</w:t>
       </w:r>
     </w:p>
     <w:p>
       <w:r>
-        <w:t>SENTRIX AI proves that the most effective way to defeat GenAI-enabled financial fraud is to build a unified system that generates, stress-tests, and actively evolves its own defenses. All components—from synthetic generation to real-time ONNX inference and active retraining—are fully open-source, reproducible, and live in production:</w:t>
+        <w:t>SENTRIX AI demonstrates a unified prototype that generates, stress-tests, and improves fraud defences across text, payment, and money-movement signals. The source, live web demonstration, and API documentation are available here:</w:t>
       </w:r>
     </w:p>
     <w:p>

</xml_diff>